<commit_message>
Repositorio publico: instalacao sem login do GitHub
Remove dos roteiros a janela de login e o aviso de parar no passo 4.
README avisa que nada de cliente pode entrar aqui.

Co-Authored-By: Claude Opus 5 <noreply@anthropic.com>
</commit_message>
<xml_diff>
--- a/Instalar skill trabalhista - passo a passo.docx
+++ b/Instalar skill trabalhista - passo a passo.docx
@@ -409,7 +409,7 @@
           <w:sz w:val="30"/>
           <w:szCs w:val="30"/>
         </w:rPr>
-        <w:t xml:space="preserve">Antes: três janelas que vão aparecer</w:t>
+        <w:t xml:space="preserve">Antes: duas janelas que vão aparecer</w:t>
       </w:r>
     </w:p>
     <w:p>
@@ -645,107 +645,6 @@
           </w:p>
         </w:tc>
       </w:tr>
-      <w:tr>
-        <w:trPr>
-          <w:cantSplit/>
-        </w:trPr>
-        <w:tc>
-          <w:tcPr>
-            <w:tcW w:type="dxa" w:w="1500"/>
-            <w:tcBorders>
-              <w:top w:val="single" w:color="D9E2E0" w:sz="4"/>
-              <w:left w:val="single" w:color="D9E2E0" w:sz="4"/>
-              <w:bottom w:val="single" w:color="D9E2E0" w:sz="4"/>
-              <w:right w:val="single" w:color="D9E2E0" w:sz="4"/>
-            </w:tcBorders>
-            <w:tcMar>
-              <w:top w:type="dxa" w:w="110"/>
-              <w:left w:type="dxa" w:w="160"/>
-              <w:bottom w:type="dxa" w:w="110"/>
-              <w:right w:type="dxa" w:w="160"/>
-            </w:tcMar>
-          </w:tcPr>
-          <w:p>
-            <w:pPr>
-              <w:spacing w:after="0" w:before="0" w:line="280"/>
-            </w:pPr>
-            <w:r>
-              <w:rPr>
-                <w:rFonts w:ascii="Calibri" w:cs="Calibri" w:eastAsia="Calibri" w:hAnsi="Calibri"/>
-                <w:b/>
-                <w:bCs/>
-                <w:color w:val="9E2C2C"/>
-                <w:spacing w:val="20"/>
-                <w:sz w:val="20"/>
-                <w:szCs w:val="20"/>
-              </w:rPr>
-              <w:t xml:space="preserve">PARE</w:t>
-            </w:r>
-          </w:p>
-        </w:tc>
-        <w:tc>
-          <w:tcPr>
-            <w:tcW w:type="dxa" w:w="8138"/>
-            <w:tcBorders>
-              <w:top w:val="single" w:color="D9E2E0" w:sz="4"/>
-              <w:left w:val="single" w:color="D9E2E0" w:sz="4"/>
-              <w:bottom w:val="single" w:color="D9E2E0" w:sz="4"/>
-              <w:right w:val="single" w:color="D9E2E0" w:sz="4"/>
-            </w:tcBorders>
-            <w:tcMar>
-              <w:top w:type="dxa" w:w="110"/>
-              <w:left w:type="dxa" w:w="160"/>
-              <w:bottom w:type="dxa" w:w="110"/>
-              <w:right w:type="dxa" w:w="160"/>
-            </w:tcMar>
-          </w:tcPr>
-          <w:p>
-            <w:pPr>
-              <w:spacing w:after="0" w:before="0" w:line="280"/>
-            </w:pPr>
-            <w:r>
-              <w:rPr>
-                <w:rFonts w:ascii="Calibri" w:cs="Calibri" w:eastAsia="Calibri" w:hAnsi="Calibri"/>
-                <w:b/>
-                <w:bCs/>
-                <w:color w:val="111A1B"/>
-                <w:sz w:val="21"/>
-                <w:szCs w:val="21"/>
-              </w:rPr>
-              <w:t xml:space="preserve">Uma janela do GitHub pedindo login</w:t>
-            </w:r>
-            <w:r>
-              <w:rPr>
-                <w:rFonts w:ascii="Calibri" w:cs="Calibri" w:eastAsia="Calibri" w:hAnsi="Calibri"/>
-                <w:color w:val="111A1B"/>
-                <w:sz w:val="21"/>
-                <w:szCs w:val="21"/>
-              </w:rPr>
-              <w:t xml:space="preserve"> (só no passo 4). </w:t>
-            </w:r>
-            <w:r>
-              <w:rPr>
-                <w:rFonts w:ascii="Calibri" w:cs="Calibri" w:eastAsia="Calibri" w:hAnsi="Calibri"/>
-                <w:b/>
-                <w:bCs/>
-                <w:color w:val="111A1B"/>
-                <w:sz w:val="21"/>
-                <w:szCs w:val="21"/>
-              </w:rPr>
-              <w:t xml:space="preserve">Pare e chame quem te mandou este documento.</w:t>
-            </w:r>
-            <w:r>
-              <w:rPr>
-                <w:rFonts w:ascii="Calibri" w:cs="Calibri" w:eastAsia="Calibri" w:hAnsi="Calibri"/>
-                <w:color w:val="111A1B"/>
-                <w:sz w:val="21"/>
-                <w:szCs w:val="21"/>
-              </w:rPr>
-              <w:t xml:space="preserve"> A senha não é sua.</w:t>
-            </w:r>
-          </w:p>
-        </w:tc>
-      </w:tr>
     </w:tbl>
     <w:p>
       <w:pPr>
@@ -1514,94 +1413,7 @@
                 <w:sz w:val="20"/>
                 <w:szCs w:val="20"/>
               </w:rPr>
-              <w:t xml:space="preserve">Dentro da pasta claude-skills que você acabou de criar, baixe este repositório usando git clone: https://github.com/ggvadv/skill-banco-inteligencia-trabalhista.git — se abrir alguma janela pedindo login do GitHub, pare e me avise.</w:t>
-            </w:r>
-          </w:p>
-        </w:tc>
-      </w:tr>
-    </w:tbl>
-    <w:p>
-      <w:pPr>
-        <w:spacing w:after="200" w:before="0" w:line="120"/>
-      </w:pPr>
-    </w:p>
-    <w:tbl>
-      <w:tblPr>
-        <w:tblW w:type="dxa" w:w="9638"/>
-        <w:tblBorders>
-          <w:top w:val="none" w:color="FFFFFF" w:sz="0"/>
-          <w:left w:val="none" w:color="FFFFFF" w:sz="0"/>
-          <w:bottom w:val="none" w:color="FFFFFF" w:sz="0"/>
-          <w:right w:val="none" w:color="FFFFFF" w:sz="0"/>
-          <w:insideH w:val="none" w:color="FFFFFF" w:sz="0"/>
-          <w:insideV w:val="none" w:color="FFFFFF" w:sz="0"/>
-        </w:tblBorders>
-        <w:tblLayout w:type="fixed"/>
-      </w:tblPr>
-      <w:tblGrid>
-        <w:gridCol w:w="9638"/>
-      </w:tblGrid>
-      <w:tr>
-        <w:trPr>
-          <w:cantSplit/>
-        </w:trPr>
-        <w:tc>
-          <w:tcPr>
-            <w:tcW w:type="dxa" w:w="9638"/>
-            <w:tcBorders>
-              <w:top w:val="none" w:color="FFFFFF" w:sz="0"/>
-              <w:left w:val="single" w:color="9E2C2C" w:sz="24"/>
-              <w:bottom w:val="none" w:color="FFFFFF" w:sz="0"/>
-              <w:right w:val="none" w:color="FFFFFF" w:sz="0"/>
-            </w:tcBorders>
-            <w:shd w:fill="F7E7E5" w:color="auto" w:val="clear"/>
-            <w:tcMar>
-              <w:top w:type="dxa" w:w="150"/>
-              <w:left w:type="dxa" w:w="220"/>
-              <w:bottom w:type="dxa" w:w="150"/>
-              <w:right w:type="dxa" w:w="220"/>
-            </w:tcMar>
-          </w:tcPr>
-          <w:p>
-            <w:pPr>
-              <w:spacing w:after="50" w:before="0" w:line="300"/>
-            </w:pPr>
-            <w:r>
-              <w:rPr>
-                <w:rFonts w:ascii="Calibri" w:cs="Calibri" w:eastAsia="Calibri" w:hAnsi="Calibri"/>
-                <w:b/>
-                <w:bCs/>
-                <w:color w:val="9E2C2C"/>
-                <w:spacing w:val="30"/>
-                <w:sz w:val="16"/>
-                <w:szCs w:val="16"/>
-              </w:rPr>
-              <w:t xml:space="preserve">SE ABRIR A JANELA DE LOGIN DO GITHUB</w:t>
-            </w:r>
-          </w:p>
-          <w:p>
-            <w:pPr>
-              <w:spacing w:after="0" w:before="0" w:line="290"/>
-            </w:pPr>
-            <w:r>
-              <w:rPr>
-                <w:rFonts w:ascii="Calibri" w:cs="Calibri" w:eastAsia="Calibri" w:hAnsi="Calibri"/>
-                <w:b/>
-                <w:bCs/>
-                <w:color w:val="111A1B"/>
-                <w:sz w:val="21"/>
-                <w:szCs w:val="21"/>
-              </w:rPr>
-              <w:t xml:space="preserve">Pare aí.</w:t>
-            </w:r>
-            <w:r>
-              <w:rPr>
-                <w:rFonts w:ascii="Calibri" w:cs="Calibri" w:eastAsia="Calibri" w:hAnsi="Calibri"/>
-                <w:color w:val="111A1B"/>
-                <w:sz w:val="21"/>
-                <w:szCs w:val="21"/>
-              </w:rPr>
-              <w:t xml:space="preserve"> Chame quem te mandou este documento — é essa pessoa quem tem a senha. Acontece só na primeira vez, em cada computador.</w:t>
+              <w:t xml:space="preserve">Dentro da pasta claude-skills que você acabou de criar, baixe este repositório usando git clone: https://github.com/ggvadv/skill-banco-inteligencia-trabalhista.git</w:t>
             </w:r>
           </w:p>
         </w:tc>
@@ -2710,84 +2522,6 @@
                 <w:szCs w:val="21"/>
               </w:rPr>
               <w:t xml:space="preserve">sim</w:t>
-            </w:r>
-          </w:p>
-        </w:tc>
-      </w:tr>
-      <w:tr>
-        <w:trPr>
-          <w:cantSplit/>
-        </w:trPr>
-        <w:tc>
-          <w:tcPr>
-            <w:tcW w:type="dxa" w:w="4400"/>
-            <w:tcBorders>
-              <w:top w:val="single" w:color="D9E2E0" w:sz="4"/>
-              <w:left w:val="single" w:color="D9E2E0" w:sz="4"/>
-              <w:bottom w:val="single" w:color="D9E2E0" w:sz="4"/>
-              <w:right w:val="single" w:color="D9E2E0" w:sz="4"/>
-            </w:tcBorders>
-            <w:tcMar>
-              <w:top w:type="dxa" w:w="110"/>
-              <w:left w:type="dxa" w:w="160"/>
-              <w:bottom w:type="dxa" w:w="110"/>
-              <w:right w:type="dxa" w:w="160"/>
-            </w:tcMar>
-          </w:tcPr>
-          <w:p>
-            <w:pPr>
-              <w:spacing w:after="0" w:before="0" w:line="280"/>
-            </w:pPr>
-            <w:r>
-              <w:rPr>
-                <w:rFonts w:ascii="Calibri" w:cs="Calibri" w:eastAsia="Calibri" w:hAnsi="Calibri"/>
-                <w:color w:val="3A4849"/>
-                <w:sz w:val="21"/>
-                <w:szCs w:val="21"/>
-              </w:rPr>
-              <w:t xml:space="preserve">Abriu uma janela pedindo senha do GitHub</w:t>
-            </w:r>
-          </w:p>
-        </w:tc>
-        <w:tc>
-          <w:tcPr>
-            <w:tcW w:type="dxa" w:w="5238"/>
-            <w:tcBorders>
-              <w:top w:val="single" w:color="D9E2E0" w:sz="4"/>
-              <w:left w:val="single" w:color="D9E2E0" w:sz="4"/>
-              <w:bottom w:val="single" w:color="D9E2E0" w:sz="4"/>
-              <w:right w:val="single" w:color="D9E2E0" w:sz="4"/>
-            </w:tcBorders>
-            <w:tcMar>
-              <w:top w:type="dxa" w:w="110"/>
-              <w:left w:type="dxa" w:w="160"/>
-              <w:bottom w:type="dxa" w:w="110"/>
-              <w:right w:type="dxa" w:w="160"/>
-            </w:tcMar>
-          </w:tcPr>
-          <w:p>
-            <w:pPr>
-              <w:spacing w:after="0" w:before="0" w:line="280"/>
-            </w:pPr>
-            <w:r>
-              <w:rPr>
-                <w:rFonts w:ascii="Calibri" w:cs="Calibri" w:eastAsia="Calibri" w:hAnsi="Calibri"/>
-                <w:b/>
-                <w:bCs/>
-                <w:color w:val="111A1B"/>
-                <w:sz w:val="21"/>
-                <w:szCs w:val="21"/>
-              </w:rPr>
-              <w:t xml:space="preserve">Pare.</w:t>
-            </w:r>
-            <w:r>
-              <w:rPr>
-                <w:rFonts w:ascii="Calibri" w:cs="Calibri" w:eastAsia="Calibri" w:hAnsi="Calibri"/>
-                <w:color w:val="111A1B"/>
-                <w:sz w:val="21"/>
-                <w:szCs w:val="21"/>
-              </w:rPr>
-              <w:t xml:space="preserve"> Chame quem te mandou o documento. A senha não é sua</w:t>
             </w:r>
           </w:p>
         </w:tc>

</xml_diff>